<commit_message>
Afegeix imatges al temari i a les diapositives dels subtemes 1 i 2 (AA1/AA2)
Segueix el mateix pilot aplicat abans a AA3: incorpora imatges tant al
document de teoria (.md i .docx) com a la presentacio (.pptx) de cada
subtema, sense modificar el contingut textual ja existent.

AA1 (Seguretat passiva): triangle del foc (diagrama propi), extintor,
tanca perimetral i una escena de pellicula sobre deteccio d'intrusos
(fotografies facilitades pel professorat).

AA2 (SAI): SAI APC part davantera i posterior (fotografies facilitades
pel professorat), i dos diagrames propis (tipus de SAI/temps de
transferencia, i W vs VA). Tambe s'afegeix una nota sobre llamps i
sobretensions facilitada pel professorat.
</commit_message>
<xml_diff>
--- a/RA1 - Seguretat passiva/AA1 - Seguretat passiva/T04_Temari_Seguretat_Passiva.docx
+++ b/RA1 - Seguretat passiva/AA1 - Seguretat passiva/T04_Temari_Seguretat_Passiva.docx
@@ -774,6 +774,58 @@
     </w:p>
     <w:p>
       <w:pPr>
+        <w:jc w:val="center"/>
+      </w:pPr>
+      <w:r>
+        <w:drawing>
+          <wp:inline xmlns:a="http://schemas.openxmlformats.org/drawingml/2006/main" xmlns:pic="http://schemas.openxmlformats.org/drawingml/2006/picture">
+            <wp:extent cx="5486400" cy="4457700"/>
+            <wp:docPr id="1" name="Picture 1"/>
+            <wp:cNvGraphicFramePr>
+              <a:graphicFrameLocks noChangeAspect="1"/>
+            </wp:cNvGraphicFramePr>
+            <a:graphic>
+              <a:graphicData uri="http://schemas.openxmlformats.org/drawingml/2006/picture">
+                <pic:pic>
+                  <pic:nvPicPr>
+                    <pic:cNvPr id="0" name="triangle_foc.png"/>
+                    <pic:cNvPicPr/>
+                  </pic:nvPicPr>
+                  <pic:blipFill>
+                    <a:blip r:embed="rId8"/>
+                    <a:stretch>
+                      <a:fillRect/>
+                    </a:stretch>
+                  </pic:blipFill>
+                  <pic:spPr>
+                    <a:xfrm>
+                      <a:off x="0" y="0"/>
+                      <a:ext cx="5486400" cy="4457700"/>
+                    </a:xfrm>
+                    <a:prstGeom prst="rect"/>
+                  </pic:spPr>
+                </pic:pic>
+              </a:graphicData>
+            </a:graphic>
+          </wp:inline>
+        </w:drawing>
+      </w:r>
+    </w:p>
+    <w:p>
+      <w:pPr>
+        <w:jc w:val="center"/>
+      </w:pPr>
+      <w:r>
+        <w:rPr>
+          <w:i/>
+          <w:color w:val="5B6B77"/>
+          <w:sz w:val="19"/>
+        </w:rPr>
+        <w:t>El triangle del foc: n'hi ha prou d'eliminar un dels tres elements perquè s'apagui.</w:t>
+      </w:r>
+    </w:p>
+    <w:p>
+      <w:pPr>
         <w:pStyle w:val="Heading2"/>
         <w:spacing w:after="140" w:before="260"/>
       </w:pPr>
@@ -792,6 +844,58 @@
           <w:szCs w:val="22"/>
         </w:rPr>
         <w:t xml:space="preserve">Els detectors poden ser òptics (detecten variacions de llum causades pel fum) o de temperatura, i poden ser manuals o automàtics. La extinció, igualment, pot ser manual (extintors, mànegues) o automàtica (aspersors d'aigua o de gas).</w:t>
+      </w:r>
+    </w:p>
+    <w:p>
+      <w:pPr>
+        <w:jc w:val="center"/>
+      </w:pPr>
+      <w:r>
+        <w:drawing>
+          <wp:inline xmlns:a="http://schemas.openxmlformats.org/drawingml/2006/main" xmlns:pic="http://schemas.openxmlformats.org/drawingml/2006/picture">
+            <wp:extent cx="2194560" cy="4362027"/>
+            <wp:docPr id="2" name="Picture 2"/>
+            <wp:cNvGraphicFramePr>
+              <a:graphicFrameLocks noChangeAspect="1"/>
+            </wp:cNvGraphicFramePr>
+            <a:graphic>
+              <a:graphicData uri="http://schemas.openxmlformats.org/drawingml/2006/picture">
+                <pic:pic>
+                  <pic:nvPicPr>
+                    <pic:cNvPr id="0" name="foto_extintor.png"/>
+                    <pic:cNvPicPr/>
+                  </pic:nvPicPr>
+                  <pic:blipFill>
+                    <a:blip r:embed="rId9"/>
+                    <a:stretch>
+                      <a:fillRect/>
+                    </a:stretch>
+                  </pic:blipFill>
+                  <pic:spPr>
+                    <a:xfrm>
+                      <a:off x="0" y="0"/>
+                      <a:ext cx="2194560" cy="4362027"/>
+                    </a:xfrm>
+                    <a:prstGeom prst="rect"/>
+                  </pic:spPr>
+                </pic:pic>
+              </a:graphicData>
+            </a:graphic>
+          </wp:inline>
+        </w:drawing>
+      </w:r>
+    </w:p>
+    <w:p>
+      <w:pPr>
+        <w:jc w:val="center"/>
+      </w:pPr>
+      <w:r>
+        <w:rPr>
+          <w:i/>
+          <w:color w:val="5B6B77"/>
+          <w:sz w:val="19"/>
+        </w:rPr>
+        <w:t>Els extintors són una de les mesures bàsiques de prevenció d'incendis. Cal que passin revisions periòdiques perquè siguin fiables quan calgui.</w:t>
       </w:r>
     </w:p>
     <w:p>
@@ -1346,6 +1450,58 @@
     </w:p>
     <w:p>
       <w:pPr>
+        <w:jc w:val="center"/>
+      </w:pPr>
+      <w:r>
+        <w:drawing>
+          <wp:inline xmlns:a="http://schemas.openxmlformats.org/drawingml/2006/main" xmlns:pic="http://schemas.openxmlformats.org/drawingml/2006/picture">
+            <wp:extent cx="3200400" cy="2141621"/>
+            <wp:docPr id="3" name="Picture 3"/>
+            <wp:cNvGraphicFramePr>
+              <a:graphicFrameLocks noChangeAspect="1"/>
+            </wp:cNvGraphicFramePr>
+            <a:graphic>
+              <a:graphicData uri="http://schemas.openxmlformats.org/drawingml/2006/picture">
+                <pic:pic>
+                  <pic:nvPicPr>
+                    <pic:cNvPr id="0" name="foto_tanca_perimetral.png"/>
+                    <pic:cNvPicPr/>
+                  </pic:nvPicPr>
+                  <pic:blipFill>
+                    <a:blip r:embed="rId10"/>
+                    <a:stretch>
+                      <a:fillRect/>
+                    </a:stretch>
+                  </pic:blipFill>
+                  <pic:spPr>
+                    <a:xfrm>
+                      <a:off x="0" y="0"/>
+                      <a:ext cx="3200400" cy="2141621"/>
+                    </a:xfrm>
+                    <a:prstGeom prst="rect"/>
+                  </pic:spPr>
+                </pic:pic>
+              </a:graphicData>
+            </a:graphic>
+          </wp:inline>
+        </w:drawing>
+      </w:r>
+    </w:p>
+    <w:p>
+      <w:pPr>
+        <w:jc w:val="center"/>
+      </w:pPr>
+      <w:r>
+        <w:rPr>
+          <w:i/>
+          <w:color w:val="5B6B77"/>
+          <w:sz w:val="19"/>
+        </w:rPr>
+        <w:t>Les tanques han de tenir una alçada determinada perquè siguin eficaces com a mesura dissuasiva contra intrusos.</w:t>
+      </w:r>
+    </w:p>
+    <w:p>
+      <w:pPr>
         <w:pStyle w:val="Heading2"/>
         <w:spacing w:after="140" w:before="260"/>
       </w:pPr>
@@ -1412,6 +1568,58 @@
           <w:szCs w:val="22"/>
         </w:rPr>
         <w:t xml:space="preserve">L'avaluació d'incidències és igualment important: els falsos positius existeixen, i no tota alarma és un atac real. Cal un protocol clar i una estructura de comunicació (qui truca a qui, segons cada tipus d'incidència): per exemple, davant d'un vidre trencat hi va un guarda a mirar, però davant d'un foc a la sala de servidors, es truca als bombers.</w:t>
+      </w:r>
+    </w:p>
+    <w:p>
+      <w:pPr>
+        <w:jc w:val="center"/>
+      </w:pPr>
+      <w:r>
+        <w:drawing>
+          <wp:inline xmlns:a="http://schemas.openxmlformats.org/drawingml/2006/main" xmlns:pic="http://schemas.openxmlformats.org/drawingml/2006/picture">
+            <wp:extent cx="3200400" cy="2141621"/>
+            <wp:docPr id="4" name="Picture 4"/>
+            <wp:cNvGraphicFramePr>
+              <a:graphicFrameLocks noChangeAspect="1"/>
+            </wp:cNvGraphicFramePr>
+            <a:graphic>
+              <a:graphicData uri="http://schemas.openxmlformats.org/drawingml/2006/picture">
+                <pic:pic>
+                  <pic:nvPicPr>
+                    <pic:cNvPr id="0" name="foto_intrus_pellicula.png"/>
+                    <pic:cNvPicPr/>
+                  </pic:nvPicPr>
+                  <pic:blipFill>
+                    <a:blip r:embed="rId11"/>
+                    <a:stretch>
+                      <a:fillRect/>
+                    </a:stretch>
+                  </pic:blipFill>
+                  <pic:spPr>
+                    <a:xfrm>
+                      <a:off x="0" y="0"/>
+                      <a:ext cx="3200400" cy="2141621"/>
+                    </a:xfrm>
+                    <a:prstGeom prst="rect"/>
+                  </pic:spPr>
+                </pic:pic>
+              </a:graphicData>
+            </a:graphic>
+          </wp:inline>
+        </w:drawing>
+      </w:r>
+    </w:p>
+    <w:p>
+      <w:pPr>
+        <w:jc w:val="center"/>
+      </w:pPr>
+      <w:r>
+        <w:rPr>
+          <w:i/>
+          <w:color w:val="5B6B77"/>
+          <w:sz w:val="19"/>
+        </w:rPr>
+        <w:t>Algunes pel·lícules ens mostren com els intrusos intenten burlar els sistemes de detecció d'intrusos.</w:t>
       </w:r>
     </w:p>
     <w:p>

</xml_diff>